<commit_message>
Ajout des scripts et amélioration du chatbot RH
</commit_message>
<xml_diff>
--- a/DOC_PROJET.docx
+++ b/DOC_PROJET.docx
@@ -11,6 +11,18 @@
       </w:pPr>
       <w:r>
         <w:rPr/>
+        <w:t>conda activate Projet_rag_rh</w:t>
+      </w:r>
+    </w:p>
+    <w:p>
+      <w:pPr>
+        <w:pStyle w:val="Normal"/>
+        <w:bidi w:val="0"/>
+        <w:jc w:val="start"/>
+        <w:rPr/>
+      </w:pPr>
+      <w:r>
+        <w:rPr/>
         <w:t xml:space="preserve">ERROR: No matching distribution found for langchain-core==0.2.14 (Projet_rag_rh) sacko@sacko-ASUS-Vivobook-S-15-M5506WA-M5506WA:~$ </w:t>
       </w:r>
     </w:p>
@@ -1061,106 +1073,128 @@
         <w:spacing w:before="0" w:after="140"/>
         <w:jc w:val="start"/>
         <w:rPr>
-          <w:rStyle w:val="Textesource"/>
-          <w:b w:val="false"/>
-          <w:bCs w:val="false"/>
-        </w:rPr>
-      </w:pPr>
-      <w:r>
-        <w:rPr>
-          <w:rStyle w:val="Textesource"/>
-          <w:b w:val="false"/>
-          <w:bCs w:val="false"/>
-        </w:rPr>
-        <w:t xml:space="preserve">CONNEXION AU GITHUB : </w:t>
-      </w:r>
-      <w:r>
-        <w:rPr>
-          <w:rStyle w:val="Textesource"/>
-        </w:rPr>
-        <w:t xml:space="preserve">GitHub ne veut plus de mot de passe </w:t>
-      </w:r>
-      <w:r>
-        <w:rPr>
-          <w:rStyle w:val="Emphasis"/>
-        </w:rPr>
-        <w:t>classique</w:t>
-      </w:r>
-      <w:r>
-        <w:rPr>
-          <w:rStyle w:val="Textesource"/>
-        </w:rPr>
-        <w:t xml:space="preserve">, mais </w:t>
-      </w:r>
-      <w:r>
-        <w:rPr>
-          <w:rStyle w:val="Strong"/>
-        </w:rPr>
-        <w:t>un token personnel</w:t>
-      </w:r>
-      <w:r>
-        <w:rPr>
-          <w:rStyle w:val="Textesource"/>
-        </w:rPr>
-        <w:t xml:space="preserve"> à la place.</w:t>
-      </w:r>
-    </w:p>
-    <w:p>
-      <w:pPr>
-        <w:pStyle w:val="BodyText"/>
-        <w:rPr>
+          <w:b w:val="false"/>
+          <w:bCs w:val="false"/>
+        </w:rPr>
+      </w:pPr>
+      <w:r>
+        <w:rPr>
+          <w:rStyle w:val="Textesource"/>
           <w:b/>
           <w:bCs/>
-        </w:rPr>
-      </w:pPr>
-      <w:r>
+          <w:sz w:val="26"/>
+          <w:szCs w:val="26"/>
+        </w:rPr>
+        <w:t>GITHUB :</w:t>
+      </w:r>
+    </w:p>
+    <w:p>
+      <w:pPr>
+        <w:pStyle w:val="BodyText"/>
+        <w:bidi w:val="0"/>
+        <w:spacing w:before="0" w:after="140"/>
+        <w:jc w:val="start"/>
+        <w:rPr>
+          <w:rStyle w:val="Textesource"/>
+          <w:b w:val="false"/>
+          <w:bCs w:val="false"/>
+        </w:rPr>
+      </w:pPr>
+      <w:r>
+        <w:rPr>
+          <w:rStyle w:val="Textesource"/>
+          <w:b w:val="false"/>
+          <w:bCs w:val="false"/>
+        </w:rPr>
+        <w:t xml:space="preserve">CONNEXION AU GITHUB : </w:t>
+      </w:r>
+      <w:r>
+        <w:rPr>
+          <w:rStyle w:val="Textesource"/>
+        </w:rPr>
+        <w:t xml:space="preserve">GitHub ne veut plus de mot de passe </w:t>
+      </w:r>
+      <w:r>
+        <w:rPr>
+          <w:rStyle w:val="Emphasis"/>
+        </w:rPr>
+        <w:t>classique</w:t>
+      </w:r>
+      <w:r>
+        <w:rPr>
+          <w:rStyle w:val="Textesource"/>
+        </w:rPr>
+        <w:t xml:space="preserve">, mais </w:t>
+      </w:r>
+      <w:r>
+        <w:rPr>
+          <w:rStyle w:val="Strong"/>
+        </w:rPr>
+        <w:t>un token personnel</w:t>
+      </w:r>
+      <w:r>
+        <w:rPr>
+          <w:rStyle w:val="Textesource"/>
+        </w:rPr>
+        <w:t xml:space="preserve"> à la place.</w:t>
+      </w:r>
+    </w:p>
+    <w:p>
+      <w:pPr>
+        <w:pStyle w:val="BodyText"/>
         <w:rPr>
           <w:b/>
           <w:bCs/>
         </w:rPr>
-        <w:t>Voici la méthode correcte pour te connecter et pousser ton projet :</w:t>
-      </w:r>
-    </w:p>
-    <w:p>
-      <w:pPr>
-        <w:pStyle w:val="BodyText"/>
-        <w:rPr/>
       </w:pPr>
       <w:r>
         <w:rPr>
           <w:b/>
           <w:bCs/>
         </w:rPr>
-        <w:t>OPTION 1 —</w:t>
-      </w:r>
-      <w:r>
-        <w:rPr/>
-        <w:t xml:space="preserve"> </w:t>
-      </w:r>
-      <w:r>
-        <w:rPr>
-          <w:rStyle w:val="Strong"/>
-        </w:rPr>
-        <w:t>(Recommandée)</w:t>
-      </w:r>
-      <w:r>
-        <w:rPr/>
-        <w:t xml:space="preserve"> Cloner et pousser via SSH (plus simple ensuite)</w:t>
-      </w:r>
-    </w:p>
-    <w:p>
-      <w:pPr>
-        <w:pStyle w:val="BodyText"/>
+        <w:t>Voici la méthode correcte pour te connecter et pousser ton projet :</w:t>
+      </w:r>
+    </w:p>
+    <w:p>
+      <w:pPr>
+        <w:pStyle w:val="BodyText"/>
+        <w:rPr/>
+      </w:pPr>
+      <w:r>
         <w:rPr>
           <w:b/>
           <w:bCs/>
         </w:rPr>
-      </w:pPr>
-      <w:r>
+        <w:t>OPTION 1 —</w:t>
+      </w:r>
+      <w:r>
+        <w:rPr/>
+        <w:t xml:space="preserve"> </w:t>
+      </w:r>
+      <w:r>
+        <w:rPr>
+          <w:rStyle w:val="Strong"/>
+        </w:rPr>
+        <w:t>(Recommandée)</w:t>
+      </w:r>
+      <w:r>
+        <w:rPr/>
+        <w:t xml:space="preserve"> Cloner et pousser via SSH (plus simple ensuite)</w:t>
+      </w:r>
+    </w:p>
+    <w:p>
+      <w:pPr>
+        <w:pStyle w:val="BodyText"/>
         <w:rPr>
           <w:b/>
           <w:bCs/>
         </w:rPr>
+      </w:pPr>
+      <w:r>
+        <w:rPr>
+          <w:b/>
+          <w:bCs/>
+        </w:rPr>
         <w:t>Vérifie si tu as une clé SSH :</w:t>
       </w:r>
     </w:p>
@@ -1324,7 +1358,51 @@
       </w:pPr>
       <w:r>
         <w:rPr/>
-        <w:t>git remote set-url origin git@github.com:TON-USER/TON-REPO.git</w:t>
+        <w:t xml:space="preserve">git remote set-url origin </w:t>
+      </w:r>
+      <w:hyperlink r:id="rId2">
+        <w:r>
+          <w:rPr>
+            <w:rStyle w:val="Hyperlink"/>
+          </w:rPr>
+          <w:t>git@github.com</w:t>
+        </w:r>
+      </w:hyperlink>
+      <w:r>
+        <w:rPr/>
+        <w:t>:TON-USER/TON-REPO.git</w:t>
+      </w:r>
+    </w:p>
+    <w:p>
+      <w:pPr>
+        <w:pStyle w:val="BodyText"/>
+        <w:rPr>
+          <w:b/>
+          <w:bCs/>
+        </w:rPr>
+      </w:pPr>
+      <w:r>
+        <w:rPr>
+          <w:b/>
+          <w:bCs/>
+        </w:rPr>
+        <w:t>Pousse ton code :</w:t>
+      </w:r>
+    </w:p>
+    <w:p>
+      <w:pPr>
+        <w:pStyle w:val="BodyText"/>
+        <w:rPr>
+          <w:b w:val="false"/>
+          <w:bCs w:val="false"/>
+        </w:rPr>
+      </w:pPr>
+      <w:r>
+        <w:rPr>
+          <w:b w:val="false"/>
+          <w:bCs w:val="false"/>
+        </w:rPr>
+        <w:t>git push -u origin main</w:t>
       </w:r>
     </w:p>
     <w:p>
@@ -1341,9 +1419,602 @@
       </w:pPr>
       <w:r>
         <w:rPr>
-          <w:b w:val="false"/>
-          <w:bCs w:val="false"/>
-        </w:rPr>
+          <w:rStyle w:val="Textesource"/>
+          <w:b w:val="false"/>
+          <w:bCs w:val="false"/>
+        </w:rPr>
+        <w:t>Parfait 👍</w:t>
+        <w:br/>
+        <w:t xml:space="preserve">Tu as déjà </w:t>
+      </w:r>
+      <w:r>
+        <w:rPr>
+          <w:rStyle w:val="Strong"/>
+        </w:rPr>
+        <w:t>tout ce qu’il faut</w:t>
+      </w:r>
+      <w:r>
+        <w:rPr>
+          <w:rStyle w:val="Textesource"/>
+          <w:b w:val="false"/>
+          <w:bCs w:val="false"/>
+        </w:rPr>
+        <w:t xml:space="preserve"> pour te connecter à GitHub </w:t>
+      </w:r>
+      <w:r>
+        <w:rPr>
+          <w:rStyle w:val="Strong"/>
+        </w:rPr>
+        <w:t>en SSH</w:t>
+      </w:r>
+      <w:r>
+        <w:rPr>
+          <w:rStyle w:val="Textesource"/>
+          <w:b w:val="false"/>
+          <w:bCs w:val="false"/>
+        </w:rPr>
+        <w:t>, car tu as :</w:t>
+      </w:r>
+    </w:p>
+    <w:p>
+      <w:pPr>
+        <w:pStyle w:val="BodyText"/>
+        <w:bidi w:val="0"/>
+        <w:spacing w:before="0" w:after="140"/>
+        <w:jc w:val="start"/>
+        <w:rPr>
+          <w:rStyle w:val="Textesource"/>
+          <w:b w:val="false"/>
+          <w:bCs w:val="false"/>
+        </w:rPr>
+      </w:pPr>
+      <w:r>
+        <w:rPr>
+          <w:rStyle w:val="Textesource"/>
+          <w:b w:val="false"/>
+          <w:bCs w:val="false"/>
+        </w:rPr>
+        <w:t>id_ed25519          ← ta clé privée</w:t>
+      </w:r>
+    </w:p>
+    <w:p>
+      <w:pPr>
+        <w:pStyle w:val="BodyText"/>
+        <w:bidi w:val="0"/>
+        <w:spacing w:before="0" w:after="140"/>
+        <w:jc w:val="start"/>
+        <w:rPr>
+          <w:rStyle w:val="Textesource"/>
+          <w:b w:val="false"/>
+          <w:bCs w:val="false"/>
+        </w:rPr>
+      </w:pPr>
+      <w:r>
+        <w:rPr>
+          <w:rStyle w:val="Textesource"/>
+          <w:b w:val="false"/>
+          <w:bCs w:val="false"/>
+        </w:rPr>
+        <w:t>id_ed25519.pub      ← ta clé publique</w:t>
+      </w:r>
+    </w:p>
+    <w:p>
+      <w:pPr>
+        <w:pStyle w:val="BodyText"/>
+        <w:bidi w:val="0"/>
+        <w:spacing w:before="0" w:after="140"/>
+        <w:jc w:val="start"/>
+        <w:rPr>
+          <w:rStyle w:val="Textesource"/>
+          <w:b w:val="false"/>
+          <w:bCs w:val="false"/>
+        </w:rPr>
+      </w:pPr>
+      <w:r>
+        <w:rPr>
+          <w:rStyle w:val="Textesource"/>
+          <w:b w:val="false"/>
+          <w:bCs w:val="false"/>
+        </w:rPr>
+        <w:t xml:space="preserve">Donc tu n’as </w:t>
+      </w:r>
+      <w:r>
+        <w:rPr>
+          <w:rStyle w:val="Strong"/>
+        </w:rPr>
+        <w:t>pas besoin de créer une nouvelle clé</w:t>
+      </w:r>
+      <w:r>
+        <w:rPr>
+          <w:rStyle w:val="Textesource"/>
+          <w:b w:val="false"/>
+          <w:bCs w:val="false"/>
+        </w:rPr>
+        <w:t xml:space="preserve"> : on va juste vérifier, ajouter la clé dans GitHub et mettre ton remote en SSH.</w:t>
+      </w:r>
+    </w:p>
+    <w:p>
+      <w:pPr>
+        <w:pStyle w:val="BodyText"/>
+        <w:bidi w:val="0"/>
+        <w:spacing w:before="0" w:after="140"/>
+        <w:jc w:val="start"/>
+        <w:rPr>
+          <w:b w:val="false"/>
+          <w:bCs w:val="false"/>
+        </w:rPr>
+      </w:pPr>
+      <w:r>
+        <w:rPr>
+          <w:rStyle w:val="Textesource"/>
+          <w:b/>
+          <w:bCs/>
+        </w:rPr>
+        <w:t>On fait ça étape par étape 👇</w:t>
+      </w:r>
+    </w:p>
+    <w:p>
+      <w:pPr>
+        <w:pStyle w:val="Lignehorizontale"/>
+        <w:rPr/>
+      </w:pPr>
+      <w:r>
+        <w:rPr/>
+      </w:r>
+    </w:p>
+    <w:p>
+      <w:pPr>
+        <w:pStyle w:val="Heading1"/>
+        <w:rPr/>
+      </w:pPr>
+      <w:r>
+        <w:rPr/>
+        <w:t xml:space="preserve">✅ </w:t>
+      </w:r>
+      <w:r>
+        <w:rPr>
+          <w:rStyle w:val="Strong"/>
+          <w:b/>
+          <w:bCs/>
+        </w:rPr>
+        <w:t>ÉTAPE 1 — Vérifier ta clé publique</w:t>
+      </w:r>
+    </w:p>
+    <w:p>
+      <w:pPr>
+        <w:pStyle w:val="BodyText"/>
+        <w:rPr/>
+      </w:pPr>
+      <w:r>
+        <w:rPr/>
+        <w:t>Affiche-la :</w:t>
+      </w:r>
+    </w:p>
+    <w:p>
+      <w:pPr>
+        <w:pStyle w:val="BodyText"/>
+        <w:bidi w:val="0"/>
+        <w:spacing w:before="0" w:after="140"/>
+        <w:jc w:val="start"/>
+        <w:rPr>
+          <w:rStyle w:val="Textesource"/>
+          <w:b w:val="false"/>
+          <w:bCs w:val="false"/>
+        </w:rPr>
+      </w:pPr>
+      <w:r>
+        <w:rPr>
+          <w:rStyle w:val="Textesource"/>
+          <w:b w:val="false"/>
+          <w:bCs w:val="false"/>
+        </w:rPr>
+        <w:t>cat ~/.ssh/id_ed25519.pub</w:t>
+      </w:r>
+    </w:p>
+    <w:p>
+      <w:pPr>
+        <w:pStyle w:val="BodyText"/>
+        <w:bidi w:val="0"/>
+        <w:spacing w:before="0" w:after="140"/>
+        <w:jc w:val="start"/>
+        <w:rPr>
+          <w:rStyle w:val="Textesource"/>
+          <w:b w:val="false"/>
+          <w:bCs w:val="false"/>
+        </w:rPr>
+      </w:pPr>
+      <w:r>
+        <w:rPr>
+          <w:rStyle w:val="Textesource"/>
+          <w:b w:val="false"/>
+          <w:bCs w:val="false"/>
+        </w:rPr>
+        <w:t>Tu dois obtenir quelque chose comme :</w:t>
+      </w:r>
+    </w:p>
+    <w:p>
+      <w:pPr>
+        <w:pStyle w:val="Texteprformat"/>
+        <w:bidi w:val="0"/>
+        <w:spacing w:before="0" w:after="283"/>
+        <w:ind w:hanging="0" w:start="0" w:end="0"/>
+        <w:rPr/>
+      </w:pPr>
+      <w:r>
+        <w:rPr>
+          <w:rStyle w:val="Textesource"/>
+        </w:rPr>
+        <w:t>ssh-ed25519 AAAAC3Nz... ton_email</w:t>
+      </w:r>
+    </w:p>
+    <w:p>
+      <w:pPr>
+        <w:pStyle w:val="Heading1"/>
+        <w:bidi w:val="0"/>
+        <w:spacing w:before="0" w:after="140"/>
+        <w:jc w:val="start"/>
+        <w:rPr>
+          <w:rStyle w:val="Textesource"/>
+          <w:b w:val="false"/>
+          <w:bCs w:val="false"/>
+        </w:rPr>
+      </w:pPr>
+      <w:r>
+        <w:rPr>
+          <w:rStyle w:val="Strong"/>
+          <w:b/>
+          <w:bCs/>
+        </w:rPr>
+        <w:t>ÉTAPE 2 — Ajouter la clé SSH dans GitHub</w:t>
+      </w:r>
+    </w:p>
+    <w:p>
+      <w:pPr>
+        <w:pStyle w:val="BodyText"/>
+        <w:rPr/>
+      </w:pPr>
+      <w:r>
+        <w:rPr/>
+        <w:t>1️⃣ Va ici :</w:t>
+        <w:br/>
+        <w:t xml:space="preserve">👉 </w:t>
+      </w:r>
+      <w:hyperlink r:id="rId3" w:tgtFrame="_new">
+        <w:r>
+          <w:rPr>
+            <w:rStyle w:val="Hyperlink"/>
+          </w:rPr>
+          <w:t>https://github.com/settings/keys</w:t>
+        </w:r>
+      </w:hyperlink>
+    </w:p>
+    <w:p>
+      <w:pPr>
+        <w:pStyle w:val="BodyText"/>
+        <w:rPr/>
+      </w:pPr>
+      <w:r>
+        <w:rPr/>
+        <w:t>2️⃣ Clique :</w:t>
+        <w:br/>
+        <w:t xml:space="preserve">🟦 </w:t>
+      </w:r>
+      <w:r>
+        <w:rPr>
+          <w:rStyle w:val="Strong"/>
+        </w:rPr>
+        <w:t>New SSH key</w:t>
+      </w:r>
+    </w:p>
+    <w:p>
+      <w:pPr>
+        <w:pStyle w:val="BodyText"/>
+        <w:rPr/>
+      </w:pPr>
+      <w:r>
+        <w:rPr/>
+        <w:t>3️⃣ Donne un nom, par ex : Laptop-ASUS</w:t>
+      </w:r>
+    </w:p>
+    <w:p>
+      <w:pPr>
+        <w:pStyle w:val="BodyText"/>
+        <w:rPr/>
+      </w:pPr>
+      <w:r>
+        <w:rPr/>
+        <w:t>Colle ta clé publique → Valide.</w:t>
+      </w:r>
+    </w:p>
+    <w:p>
+      <w:pPr>
+        <w:pStyle w:val="Heading1"/>
+        <w:rPr/>
+      </w:pPr>
+      <w:r>
+        <w:rPr>
+          <w:rStyle w:val="Strong"/>
+          <w:b/>
+          <w:bCs/>
+        </w:rPr>
+        <w:t>ÉTAPE 3 — Changer ton remote Git vers SSH</w:t>
+      </w:r>
+    </w:p>
+    <w:p>
+      <w:pPr>
+        <w:pStyle w:val="BodyText"/>
+        <w:rPr/>
+      </w:pPr>
+      <w:r>
+        <w:rPr/>
+        <w:t>Place-toi dans ton projet :</w:t>
+      </w:r>
+    </w:p>
+    <w:p>
+      <w:pPr>
+        <w:pStyle w:val="BodyText"/>
+        <w:rPr/>
+      </w:pPr>
+      <w:r>
+        <w:rPr/>
+        <w:t>cd /home/sacko/Documents/Chatbot-Rh-Rag</w:t>
+      </w:r>
+    </w:p>
+    <w:p>
+      <w:pPr>
+        <w:pStyle w:val="BodyText"/>
+        <w:rPr/>
+      </w:pPr>
+      <w:r>
+        <w:rPr/>
+        <w:t>Affiche l’URL actuelle :</w:t>
+      </w:r>
+    </w:p>
+    <w:p>
+      <w:pPr>
+        <w:pStyle w:val="Texteprformat"/>
+        <w:bidi w:val="0"/>
+        <w:spacing w:before="0" w:after="283"/>
+        <w:ind w:hanging="0" w:start="0" w:end="0"/>
+        <w:rPr/>
+      </w:pPr>
+      <w:r>
+        <w:rPr>
+          <w:rStyle w:val="Textesource"/>
+        </w:rPr>
+        <w:t>git remote -v</w:t>
+      </w:r>
+    </w:p>
+    <w:p>
+      <w:pPr>
+        <w:pStyle w:val="BodyText"/>
+        <w:rPr/>
+      </w:pPr>
+      <w:r>
+        <w:rPr/>
+        <w:t>Tu vas voir :</w:t>
+      </w:r>
+    </w:p>
+    <w:p>
+      <w:pPr>
+        <w:pStyle w:val="Texteprformat"/>
+        <w:bidi w:val="0"/>
+        <w:spacing w:before="0" w:after="283"/>
+        <w:ind w:hanging="0" w:start="0" w:end="0"/>
+        <w:rPr/>
+      </w:pPr>
+      <w:r>
+        <w:rPr>
+          <w:rStyle w:val="Textesource"/>
+        </w:rPr>
+        <w:t>origin https://github.com/TON-USER/Chatbot-Rh-Rag.git</w:t>
+      </w:r>
+    </w:p>
+    <w:p>
+      <w:pPr>
+        <w:pStyle w:val="BodyText"/>
+        <w:rPr/>
+      </w:pPr>
+      <w:r>
+        <w:rPr/>
+        <w:t>Change-la en SSH :</w:t>
+      </w:r>
+    </w:p>
+    <w:p>
+      <w:pPr>
+        <w:pStyle w:val="Texteprformat"/>
+        <w:bidi w:val="0"/>
+        <w:spacing w:before="0" w:after="283"/>
+        <w:ind w:hanging="0" w:start="0" w:end="0"/>
+        <w:rPr/>
+      </w:pPr>
+      <w:r>
+        <w:rPr>
+          <w:rStyle w:val="Textesource"/>
+        </w:rPr>
+        <w:t>git remote set-url origin git@github.com:TON-USER/Chatbot-Rh-Rag.git</w:t>
+      </w:r>
+    </w:p>
+    <w:p>
+      <w:pPr>
+        <w:pStyle w:val="BodyText"/>
+        <w:rPr/>
+      </w:pPr>
+      <w:r>
+        <w:rPr/>
+        <w:t xml:space="preserve">⚠️ </w:t>
+      </w:r>
+      <w:r>
+        <w:rPr/>
+        <w:t xml:space="preserve">N’oublie pas de remplacer </w:t>
+      </w:r>
+      <w:r>
+        <w:rPr>
+          <w:rStyle w:val="Textesource"/>
+        </w:rPr>
+        <w:t>TON-USER</w:t>
+      </w:r>
+      <w:r>
+        <w:rPr/>
+        <w:t xml:space="preserve"> par ton vrai username GitHub.</w:t>
+      </w:r>
+    </w:p>
+    <w:p>
+      <w:pPr>
+        <w:pStyle w:val="Heading1"/>
+        <w:rPr/>
+      </w:pPr>
+      <w:r>
+        <w:rPr/>
+        <w:t xml:space="preserve">✅ </w:t>
+      </w:r>
+      <w:r>
+        <w:rPr>
+          <w:rStyle w:val="Strong"/>
+          <w:b/>
+          <w:bCs/>
+        </w:rPr>
+        <w:t>ÉTAPE 4 — Tester la connexion SSH</w:t>
+      </w:r>
+    </w:p>
+    <w:p>
+      <w:pPr>
+        <w:pStyle w:val="Texteprformat"/>
+        <w:bidi w:val="0"/>
+        <w:spacing w:before="0" w:after="283"/>
+        <w:ind w:hanging="0" w:start="0" w:end="0"/>
+        <w:rPr/>
+      </w:pPr>
+      <w:r>
+        <w:rPr>
+          <w:rStyle w:val="Textesource"/>
+        </w:rPr>
+        <w:t>ssh -T git@github.com</w:t>
+      </w:r>
+    </w:p>
+    <w:p>
+      <w:pPr>
+        <w:pStyle w:val="BodyText"/>
+        <w:rPr/>
+      </w:pPr>
+      <w:r>
+        <w:rPr/>
+        <w:t>Tu devrais voir :</w:t>
+      </w:r>
+    </w:p>
+    <w:p>
+      <w:pPr>
+        <w:pStyle w:val="Texteprformat"/>
+        <w:bidi w:val="0"/>
+        <w:spacing w:before="0" w:after="283"/>
+        <w:ind w:hanging="0" w:start="0" w:end="0"/>
+        <w:rPr/>
+      </w:pPr>
+      <w:r>
+        <w:rPr>
+          <w:rStyle w:val="Textesource"/>
+        </w:rPr>
+        <w:t>Hi TON-USER! You've successfully authenticated, but GitHub does not provide shell access.</w:t>
+      </w:r>
+    </w:p>
+    <w:p>
+      <w:pPr>
+        <w:pStyle w:val="BodyText"/>
+        <w:rPr/>
+      </w:pPr>
+      <w:r>
+        <w:rPr/>
+        <w:t xml:space="preserve">Si c’est le cas → </w:t>
+      </w:r>
+      <w:r>
+        <w:rPr>
+          <w:rStyle w:val="Strong"/>
+        </w:rPr>
+        <w:t>tout est OK</w:t>
+      </w:r>
+      <w:r>
+        <w:rPr/>
+        <w:t xml:space="preserve"> 🎉</w:t>
+      </w:r>
+    </w:p>
+    <w:p>
+      <w:pPr>
+        <w:pStyle w:val="Lignehorizontale"/>
+        <w:rPr/>
+      </w:pPr>
+      <w:r>
+        <w:rPr/>
+      </w:r>
+    </w:p>
+    <w:p>
+      <w:pPr>
+        <w:pStyle w:val="Heading1"/>
+        <w:rPr/>
+      </w:pPr>
+      <w:r>
+        <w:rPr/>
+        <w:t xml:space="preserve">✅ </w:t>
+      </w:r>
+      <w:r>
+        <w:rPr>
+          <w:rStyle w:val="Strong"/>
+          <w:b/>
+          <w:bCs/>
+        </w:rPr>
+        <w:t>ÉTAPE 5 — Pousser ton code sans mot de passe</w:t>
+      </w:r>
+    </w:p>
+    <w:p>
+      <w:pPr>
+        <w:pStyle w:val="BodyText"/>
+        <w:rPr/>
+      </w:pPr>
+      <w:r>
+        <w:rPr/>
+        <w:t xml:space="preserve">Maintenant tu peux pousser </w:t>
+      </w:r>
+      <w:r>
+        <w:rPr>
+          <w:rStyle w:val="Strong"/>
+        </w:rPr>
+        <w:t>sans login, sans password, sans token</w:t>
+      </w:r>
+      <w:r>
+        <w:rPr/>
+        <w:t xml:space="preserve"> :</w:t>
+      </w:r>
+    </w:p>
+    <w:p>
+      <w:pPr>
+        <w:pStyle w:val="Texteprformat"/>
+        <w:bidi w:val="0"/>
+        <w:spacing w:before="0" w:after="283"/>
+        <w:ind w:hanging="0" w:start="0" w:end="0"/>
+        <w:rPr/>
+      </w:pPr>
+      <w:r>
+        <w:rPr>
+          <w:rStyle w:val="Textesource"/>
+        </w:rPr>
+        <w:t>git push -u origin main</w:t>
+      </w:r>
+    </w:p>
+    <w:p>
+      <w:pPr>
+        <w:pStyle w:val="BodyText"/>
+        <w:rPr/>
+      </w:pPr>
+      <w:r>
+        <w:rPr/>
+      </w:r>
+    </w:p>
+    <w:p>
+      <w:pPr>
+        <w:pStyle w:val="BodyText"/>
+        <w:rPr/>
+      </w:pPr>
+      <w:r>
+        <w:rPr/>
       </w:r>
     </w:p>
     <w:p>
@@ -1413,6 +2084,23 @@
       <w:sz w:val="24"/>
       <w:szCs w:val="24"/>
       <w:lang w:val="fr-FR" w:eastAsia="zh-CN" w:bidi="hi-IN"/>
+    </w:rPr>
+  </w:style>
+  <w:style w:type="paragraph" w:styleId="Heading1">
+    <w:name w:val="Heading 1"/>
+    <w:basedOn w:val="Titre"/>
+    <w:next w:val="BodyText"/>
+    <w:qFormat/>
+    <w:pPr>
+      <w:spacing w:before="240" w:after="120"/>
+      <w:outlineLvl w:val="0"/>
+    </w:pPr>
+    <w:rPr>
+      <w:rFonts w:ascii="Liberation Serif" w:hAnsi="Liberation Serif" w:eastAsia="Noto Serif CJK SC" w:cs="Noto Sans Devanagari"/>
+      <w:b/>
+      <w:bCs/>
+      <w:sz w:val="48"/>
+      <w:szCs w:val="48"/>
     </w:rPr>
   </w:style>
   <w:style w:type="paragraph" w:styleId="Heading2">
@@ -1470,6 +2158,13 @@
     <w:rPr>
       <w:i/>
       <w:iCs/>
+    </w:rPr>
+  </w:style>
+  <w:style w:type="character" w:styleId="Hyperlink">
+    <w:name w:val="Hyperlink"/>
+    <w:rPr>
+      <w:color w:val="000080"/>
+      <w:u w:val="single"/>
     </w:rPr>
   </w:style>
   <w:style w:type="paragraph" w:styleId="Titre">

</xml_diff>